<commit_message>
Updated functional requirements on the AI side
</commit_message>
<xml_diff>
--- a/BA/Part 2_Requirements Classification-20260912/Done/AI/Artifacts/1. Requirements Classification_VNS.docx
+++ b/BA/Part 2_Requirements Classification-20260912/Done/AI/Artifacts/1. Requirements Classification_VNS.docx
@@ -394,7 +394,7 @@
           <w:sz w:val="28"/>
           <w:shd w:fill="auto" w:val="clear"/>
         </w:rPr>
-        <w:t xml:space="preserve">1) Functional (6):</w:t>
+        <w:t xml:space="preserve">1) Functional (7):</w:t>
       </w:r>
     </w:p>
     <w:p>
@@ -427,7 +427,7 @@
           <w:sz w:val="28"/>
           <w:shd w:fill="auto" w:val="clear"/>
         </w:rPr>
-        <w:t xml:space="preserve">Student should be able to register with the student card number from the dean's registry import (the number is checked against the registry, then the student sets a username, password and email, and the email is confirmed), receiving role and group assignment automatically from the registry, and afterwards sign in using only the username and password.</w:t>
+        <w:t xml:space="preserve">Student should be able to sign in with the corporate email address issued by the university and an initial password (the date of birth), which must be changed at first login; accounts, role, group and courses are created automatically from the university registry, so the student needs no separate registration and takes no part in this process.</w:t>
       </w:r>
       <w:r>
         <w:rPr>
@@ -548,6 +548,39 @@
           <w:sz w:val="28"/>
           <w:shd w:fill="auto" w:val="clear"/>
         </w:rPr>
+        <w:t xml:space="preserve">Students should be able to create and use student-only chat groups that no lecturer, administrator or other non-member can access, alongside the common course chats shared with the course lecturers; messages and files in the student-only groups must be end-to-end encrypted and completely private, while the course chats and Study Spaces are encrypted in transit and at rest and stay available to search, moderation and the AI assistant (summaries, FAQs).</w:t>
+      </w:r>
+    </w:p>
+    <w:p>
+      <w:pPr>
+        <w:numPr>
+          <w:ilvl w:val="0"/>
+          <w:numId w:val="6"/>
+        </w:numPr>
+        <w:tabs>
+          <w:tab w:val="left" w:pos="360" w:leader="none"/>
+        </w:tabs>
+        <w:spacing w:before="0" w:after="200" w:line="276"/>
+        <w:ind w:right="0" w:left="360" w:hanging="360"/>
+        <w:jc w:val="left"/>
+        <w:rPr>
+          <w:rFonts w:ascii="Cambria" w:hAnsi="Cambria" w:cs="Cambria" w:eastAsia="Cambria"/>
+          <w:color w:val="auto"/>
+          <w:spacing w:val="0"/>
+          <w:position w:val="0"/>
+          <w:sz w:val="22"/>
+          <w:shd w:fill="auto" w:val="clear"/>
+        </w:rPr>
+      </w:pPr>
+      <w:r>
+        <w:rPr>
+          <w:rFonts w:ascii="Cambria" w:hAnsi="Cambria" w:cs="Cambria" w:eastAsia="Cambria"/>
+          <w:color w:val="auto"/>
+          <w:spacing w:val="0"/>
+          <w:position w:val="0"/>
+          <w:sz w:val="28"/>
+          <w:shd w:fill="auto" w:val="clear"/>
+        </w:rPr>
         <w:t xml:space="preserve">Student should be able to create or join a Study Space around a topic and work there with shared materials and a team task board.</w:t>
       </w:r>
     </w:p>
@@ -864,7 +897,7 @@
           <w:sz w:val="28"/>
           <w:shd w:fill="auto" w:val="clear"/>
         </w:rPr>
-        <w:t xml:space="preserve">Users and learning resources of the old VNS must be carried over and users onboarded: the existing openEQUELLA repository used by the Moodle-based VNS is transferred once (items, files and metadata) into the new platform's own database so that course materials are preserved, and the student and lecturer registry is imported from the dean's CSV, both before the pilot starts, plus short in-app guides and a help section for the new features.</w:t>
+        <w:t xml:space="preserve">Users and learning resources of the old VNS must be carried over and users onboarded: the existing openEQUELLA repository used by the Moodle-based VNS is transferred once (items, files and metadata) into the new platform's own database so that course materials are preserved, and the student and lecturer accounts (corporate emails, roles, groups) and courses are loaded from the university registry, both before the pilot starts, plus short in-app guides and a help section for the new features.</w:t>
       </w:r>
     </w:p>
     <w:p>
@@ -924,7 +957,7 @@
           <w:sz w:val="28"/>
           <w:shd w:fill="auto" w:val="clear"/>
         </w:rPr>
-        <w:t xml:space="preserve">The dean's office can export a registry of students and lecturers (CSV), so registration works without any integration with Moodle.</w:t>
+        <w:t xml:space="preserve">The university registry provides students' and lecturers' corporate emails, groups and course assignments for import, so accounts and courses are created without student registration and without any integration with Moodle.</w:t>
       </w:r>
     </w:p>
     <w:p>

</xml_diff>

<commit_message>
Remove Telegram, affordability and gamification from lab 2 AI files
Telegram is not allowed at Lviv Polytechnic, so the business and
stakeholder requirements now refer to WhatsApp and Discord instead.

The LLM API assumption no longer claims the service is affordable.

Following the lecturer's feedback that rewards for platform activity do
not fit a learning environment, the gamification business rule is
replaced with a rule that official grades are set only by the lecturer
and that no platform feature can change them.

Co-Authored-By: Claude Opus 5.5 <noreply@anthropic.com>
</commit_message>
<xml_diff>
--- a/BA/Part 2_Requirements Classification-20260912/Done/AI/Artifacts/1. Requirements Classification_VNS.docx
+++ b/BA/Part 2_Requirements Classification-20260912/Done/AI/Artifacts/1. Requirements Classification_VNS.docx
@@ -182,7 +182,7 @@
           <w:sz w:val="28"/>
           <w:shd w:fill="auto" w:val="clear"/>
         </w:rPr>
-        <w:t xml:space="preserve">Move course communication out of Telegram and Discord into the platform, so that questions, answers and announcements stay searchable and tied to their course.</w:t>
+        <w:t>Move course communication out of WhatsApp and Discord into the platform, so that questions, answers and announcements stay searchable and tied to their course.</w:t>
       </w:r>
     </w:p>
     <w:p>
@@ -275,7 +275,7 @@
           <w:sz w:val="28"/>
           <w:shd w:fill="auto" w:val="clear"/>
         </w:rPr>
-        <w:t xml:space="preserve">Students and lecturers should have one place for materials, deadlines, grades and course communication, without switching between the VNS, Telegram and cloud drives.</w:t>
+        <w:t>Students and lecturers should have one place for materials, deadlines, grades and course communication, without switching between the VNS, messengers such as WhatsApp or Discord, and cloud drives.</w:t>
       </w:r>
     </w:p>
     <w:p>
@@ -990,7 +990,7 @@
           <w:sz w:val="28"/>
           <w:shd w:fill="auto" w:val="clear"/>
         </w:rPr>
-        <w:t xml:space="preserve">An external LLM API is available, affordable and permitted to process course materials, with shared results cached and a daily request limit per user.</w:t>
+        <w:t>An external LLM API is available and permitted to process course materials, with shared results cached and a daily request limit per user.</w:t>
       </w:r>
     </w:p>
     <w:p>
@@ -1176,7 +1176,7 @@
           <w:sz w:val="28"/>
           <w:shd w:fill="auto" w:val="clear"/>
         </w:rPr>
-        <w:t xml:space="preserve">Gamification rewards (XP, streaks, reward shop) never affect the official grade unless the lecturer explicitly enables a bonus for a course; rankings are opt-in and show only the top-10 and the user's own position.</w:t>
+        <w:t>Official grades are set only by the lecturer: the grade forecast, the AI assistant and any other platform feature can display and explain grades but never change them.</w:t>
       </w:r>
     </w:p>
   </w:body>

</xml_diff>